<commit_message>
feat: add diet planning and expense analytics
</commit_message>
<xml_diff>
--- a/C11215139_medium_Flutter_final_report.docx
+++ b/C11215139_medium_Flutter_final_report.docx
@@ -138,14 +138,8 @@
               <w:spacing w:after="0"/>
               <w:jc w:val="left"/>
             </w:pPr>
-            <w:r/>
             <w:r>
-              <w:rPr>
-                <w:rFonts w:ascii="Microsoft JhengHei" w:hAnsi="Microsoft JhengHei" w:eastAsia="Microsoft JhengHei"/>
-                <w:b w:val="0"/>
-                <w:sz w:val="21"/>
-              </w:rPr>
-              <w:t>C112151139 簡佑丞</w:t>
+              <w:t>C11215139 簡佑丞</w:t>
             </w:r>
           </w:p>
         </w:tc>
@@ -276,13 +270,7 @@
               <w:spacing w:after="0"/>
               <w:jc w:val="left"/>
             </w:pPr>
-            <w:r/>
             <w:r>
-              <w:rPr>
-                <w:rFonts w:ascii="Microsoft JhengHei" w:hAnsi="Microsoft JhengHei" w:eastAsia="Microsoft JhengHei"/>
-                <w:b w:val="0"/>
-                <w:sz w:val="21"/>
-              </w:rPr>
               <w:t>https://github.com/yuchan27/Ingredient-AI</w:t>
             </w:r>
           </w:p>
@@ -322,16 +310,8 @@
               <w:spacing w:after="0"/>
               <w:jc w:val="left"/>
             </w:pPr>
-            <w:r/>
             <w:r>
-              <w:rPr>
-                <w:rFonts w:ascii="Microsoft JhengHei" w:hAnsi="Microsoft JhengHei" w:eastAsia="Microsoft JhengHei"/>
-                <w:b w:val="0"/>
-                <w:sz w:val="21"/>
-              </w:rPr>
               <w:t>https://github.com/yuchan27/Ingredient-AI/blob/codex/food-analysis-cloud-sync/artifacts/videos/ingredient_ai_demo.mp4</w:t>
-              <w:br/>
-              <w:t>本機備份：C:\Users\wuwu6\StudioProjects\App_medium\artifacts\videos\ingredient_ai_demo.mp4</w:t>
             </w:r>
           </w:p>
         </w:tc>
@@ -370,14 +350,8 @@
               <w:spacing w:after="0"/>
               <w:jc w:val="left"/>
             </w:pPr>
-            <w:r/>
             <w:r>
-              <w:rPr>
-                <w:rFonts w:ascii="Microsoft JhengHei" w:hAnsi="Microsoft JhengHei" w:eastAsia="Microsoft JhengHei"/>
-                <w:b w:val="0"/>
-                <w:sz w:val="21"/>
-              </w:rPr>
-              <w:t>115年6月26日</w:t>
+              <w:t>115年6月27日</w:t>
             </w:r>
           </w:p>
         </w:tc>
@@ -426,7 +400,7 @@
           <w:b w:val="0"/>
           <w:sz w:val="22"/>
         </w:rPr>
-        <w:t>本次完善後，App 不只是一個單次分析工具，也加入本地飲食日記、營養 Dashboard、帳號與雲端同步架構，使它更接近市面上可長期使用的健康分析 App。</w:t>
+        <w:t>本次完善後，App 已加入飲食記帳、日期紀錄、今日與總營養分析、下一餐建議、飲食規劃、帳號與 Neon 雲端同步，並保留 SQLite 離線可用能力，使它更接近可實際使用的健康管理 App。</w:t>
       </w:r>
     </w:p>
     <w:p>
@@ -511,7 +485,7 @@
           <w:b w:val="0"/>
           <w:sz w:val="22"/>
         </w:rPr>
-        <w:t>營養分析：Dashboard 顯示今日熱量、蛋白質、碳水、脂肪、糖、鈉、纖維與近期趨勢。</w:t>
+        <w:t>營養分析：Dashboard 可依日期查看熱量目標、剩餘熱量、蛋白質、碳水、脂肪、糖、鈉、纖維、餐費與 7 日趨勢。</w:t>
       </w:r>
     </w:p>
     <w:p>
@@ -525,7 +499,7 @@
           <w:b w:val="0"/>
           <w:sz w:val="22"/>
         </w:rPr>
-        <w:t>Neon 雲端同步：以 Node API 連接 Neon Postgres，登入後可同步分析紀錄與飲食紀錄。</w:t>
+        <w:t>Neon 雲端同步：以 Node API 連接 Neon Postgres 專案 falling-brook-09062115；本次已實測註冊、登入並同步 1 筆分析紀錄與 1 筆飲食紀錄。</w:t>
       </w:r>
     </w:p>
     <w:p>
@@ -539,7 +513,7 @@
           <w:b w:val="0"/>
           <w:sz w:val="22"/>
         </w:rPr>
-        <w:t>帳號功能：提供 Email/密碼註冊與登入 API 架構，未設定雲端時自動降級為本地模式。</w:t>
+        <w:t>帳號功能：提供 Email/密碼註冊、登入與登出；未連網時資料先保存在本地，恢復連線後可自動或手動同步 pending 資料。</w:t>
       </w:r>
     </w:p>
     <w:p>
@@ -1023,14 +997,8 @@
               <w:spacing w:after="0"/>
               <w:jc w:val="left"/>
             </w:pPr>
-            <w:r/>
             <w:r>
-              <w:rPr>
-                <w:rFonts w:ascii="Microsoft JhengHei" w:hAnsi="Microsoft JhengHei" w:eastAsia="Microsoft JhengHei"/>
-                <w:b w:val="0"/>
-                <w:sz w:val="21"/>
-              </w:rPr>
-              <w:t>飲食日記，保存熱量、蛋白質、碳水、脂肪、糖、鈉、纖維、餐別與健康分數。</w:t>
+              <w:t>飲食日記，保存日期、餐別、熱量、營養素、健康分數、花費、幣別與同步狀態。</w:t>
             </w:r>
           </w:p>
         </w:tc>
@@ -1062,7 +1030,7 @@
           <w:b w:val="0"/>
           <w:sz w:val="22"/>
         </w:rPr>
-        <w:t>使用者在 AI 分析頁輸入食品名稱，或透過麥克風語音輸入，也可拍照/選擇相簿圖片。</w:t>
+        <w:t>使用者在 AI 分析頁輸入食品名稱、餐別與花費，可透過語音輸入名稱，也可拍照或選擇相簿圖片。</w:t>
       </w:r>
     </w:p>
     <w:p>
@@ -1118,7 +1086,7 @@
           <w:b w:val="0"/>
           <w:sz w:val="22"/>
         </w:rPr>
-        <w:t>Dashboard 讀取本地飲食紀錄並計算每日總量與平均健康分數。</w:t>
+        <w:t>Dashboard 依日期彙總本地飲食紀錄，計算每日熱量、營養素與餐費，並依鈉與纖維狀況產生下一餐和飲食規劃建議。</w:t>
       </w:r>
     </w:p>
     <w:p>
@@ -1132,7 +1100,7 @@
           <w:b w:val="0"/>
           <w:sz w:val="22"/>
         </w:rPr>
-        <w:t>若已設定 Neon API 且使用者登入，CloudSyncService 會把 pending 資料同步到 Neon Postgres。</w:t>
+        <w:t>若已設定 Neon API 且使用者登入，CloudSyncService 會上傳 pending 資料；本次 Pixel 9 Pro XL 模擬器驗證後，Dashboard 顯示待同步 0 筆。</w:t>
       </w:r>
     </w:p>
     <w:p>
@@ -1158,7 +1126,7 @@
         <w:drawing>
           <wp:inline xmlns:a="http://schemas.openxmlformats.org/drawingml/2006/main" xmlns:pic="http://schemas.openxmlformats.org/drawingml/2006/picture">
             <wp:extent cx="2487168" cy="5536910"/>
-            <wp:docPr id="1" name="Picture 1"/>
+            <wp:docPr id="11" name="Picture 11" descr="圖 1：AI 分析首頁，支援食品名稱、餐別、花費、語音、拍照與相簿輸入。"/>
             <wp:cNvGraphicFramePr>
               <a:graphicFrameLocks noChangeAspect="1"/>
             </wp:cNvGraphicFramePr>
@@ -1166,11 +1134,11 @@
               <a:graphicData uri="http://schemas.openxmlformats.org/drawingml/2006/picture">
                 <pic:pic>
                   <pic:nvPicPr>
-                    <pic:cNvPr id="0" name="01_analyze_home.png"/>
+                    <pic:cNvPr id="0" name="image.png"/>
                     <pic:cNvPicPr/>
                   </pic:nvPicPr>
                   <pic:blipFill>
-                    <a:blip r:embed="rId9"/>
+                    <a:blip r:embed="rId15"/>
                     <a:stretch>
                       <a:fillRect/>
                     </a:stretch>
@@ -1201,7 +1169,7 @@
           <w:color w:val="5A5A5A"/>
           <w:sz w:val="19"/>
         </w:rPr>
-        <w:t>圖 1：AI 分析首頁，支援產品名稱、語音、拍照與相簿輸入。</w:t>
+        <w:t>圖 1：AI 分析首頁，支援食品名稱、餐別、花費、語音、拍照與相簿輸入。</w:t>
       </w:r>
     </w:p>
     <w:p>
@@ -1212,7 +1180,7 @@
         <w:drawing>
           <wp:inline xmlns:a="http://schemas.openxmlformats.org/drawingml/2006/main" xmlns:pic="http://schemas.openxmlformats.org/drawingml/2006/picture">
             <wp:extent cx="2487168" cy="5536910"/>
-            <wp:docPr id="2" name="Picture 2"/>
+            <wp:docPr id="12" name="Picture 12" descr="圖 2：實際雞排營養標籤分析結果，辨識 282 kcal、蛋白質 16.9 g、脂肪 11.6 g、碳水 27.6 g、糖 3.8 g、鈉 664 mg。"/>
             <wp:cNvGraphicFramePr>
               <a:graphicFrameLocks noChangeAspect="1"/>
             </wp:cNvGraphicFramePr>
@@ -1220,11 +1188,11 @@
               <a:graphicData uri="http://schemas.openxmlformats.org/drawingml/2006/picture">
                 <pic:pic>
                   <pic:nvPicPr>
-                    <pic:cNvPr id="0" name="02_analysis_result.png"/>
+                    <pic:cNvPr id="0" name="image.png"/>
                     <pic:cNvPicPr/>
                   </pic:nvPicPr>
                   <pic:blipFill>
-                    <a:blip r:embed="rId10"/>
+                    <a:blip r:embed="rId16"/>
                     <a:stretch>
                       <a:fillRect/>
                     </a:stretch>
@@ -1255,7 +1223,7 @@
           <w:color w:val="5A5A5A"/>
           <w:sz w:val="19"/>
         </w:rPr>
-        <w:t>圖 2：AI 分析結果，顯示健康分數、營養素與成分分析。</w:t>
+        <w:t>圖 2：實際雞排營養標籤分析結果，辨識 282 kcal、蛋白質 16.9 g、脂肪 11.6 g、碳水 27.6 g、糖 3.8 g、鈉 664 mg。</w:t>
       </w:r>
     </w:p>
     <w:p>
@@ -1266,7 +1234,7 @@
         <w:drawing>
           <wp:inline xmlns:a="http://schemas.openxmlformats.org/drawingml/2006/main" xmlns:pic="http://schemas.openxmlformats.org/drawingml/2006/picture">
             <wp:extent cx="2487168" cy="5536910"/>
-            <wp:docPr id="3" name="Picture 3"/>
+            <wp:docPr id="13" name="Picture 13" descr="圖 3：今日飲食總分析，包含日期、熱量、餐費、下一餐建議與營養警示。"/>
             <wp:cNvGraphicFramePr>
               <a:graphicFrameLocks noChangeAspect="1"/>
             </wp:cNvGraphicFramePr>
@@ -1274,11 +1242,11 @@
               <a:graphicData uri="http://schemas.openxmlformats.org/drawingml/2006/picture">
                 <pic:pic>
                   <pic:nvPicPr>
-                    <pic:cNvPr id="0" name="03_dashboard.png"/>
+                    <pic:cNvPr id="0" name="image.png"/>
                     <pic:cNvPicPr/>
                   </pic:nvPicPr>
                   <pic:blipFill>
-                    <a:blip r:embed="rId11"/>
+                    <a:blip r:embed="rId17"/>
                     <a:stretch>
                       <a:fillRect/>
                     </a:stretch>
@@ -1309,7 +1277,7 @@
           <w:color w:val="5A5A5A"/>
           <w:sz w:val="19"/>
         </w:rPr>
-        <w:t>圖 3：營養分析 Dashboard，顯示今日攝取與近期紀錄。</w:t>
+        <w:t>圖 3：今日飲食總分析，包含日期、熱量、餐費、下一餐建議與營養警示。</w:t>
       </w:r>
     </w:p>
     <w:p>
@@ -1320,7 +1288,7 @@
         <w:drawing>
           <wp:inline xmlns:a="http://schemas.openxmlformats.org/drawingml/2006/main" xmlns:pic="http://schemas.openxmlformats.org/drawingml/2006/picture">
             <wp:extent cx="2487168" cy="5536910"/>
-            <wp:docPr id="4" name="Picture 4"/>
+            <wp:docPr id="14" name="Picture 14" descr="圖 4：分析紀錄頁，真實雞排資料已標示同步至 Neon。"/>
             <wp:cNvGraphicFramePr>
               <a:graphicFrameLocks noChangeAspect="1"/>
             </wp:cNvGraphicFramePr>
@@ -1328,11 +1296,11 @@
               <a:graphicData uri="http://schemas.openxmlformats.org/drawingml/2006/picture">
                 <pic:pic>
                   <pic:nvPicPr>
-                    <pic:cNvPr id="0" name="04_history.png"/>
+                    <pic:cNvPr id="0" name="image.png"/>
                     <pic:cNvPicPr/>
                   </pic:nvPicPr>
                   <pic:blipFill>
-                    <a:blip r:embed="rId12"/>
+                    <a:blip r:embed="rId18"/>
                     <a:stretch>
                       <a:fillRect/>
                     </a:stretch>
@@ -1363,7 +1331,7 @@
           <w:color w:val="5A5A5A"/>
           <w:sz w:val="19"/>
         </w:rPr>
-        <w:t>圖 4：掃描紀錄頁，顯示分析歷史與待同步狀態。</w:t>
+        <w:t>圖 4：分析紀錄頁，真實雞排資料已標示同步至 Neon。</w:t>
       </w:r>
     </w:p>
     <w:p>
@@ -1374,7 +1342,7 @@
         <w:drawing>
           <wp:inline xmlns:a="http://schemas.openxmlformats.org/drawingml/2006/main" xmlns:pic="http://schemas.openxmlformats.org/drawingml/2006/picture">
             <wp:extent cx="2487168" cy="5536910"/>
-            <wp:docPr id="5" name="Picture 5"/>
+            <wp:docPr id="15" name="Picture 15" descr="圖 5：帳號與雲端同步頁，顯示已登入的測試帳號與手動同步功能。"/>
             <wp:cNvGraphicFramePr>
               <a:graphicFrameLocks noChangeAspect="1"/>
             </wp:cNvGraphicFramePr>
@@ -1382,11 +1350,11 @@
               <a:graphicData uri="http://schemas.openxmlformats.org/drawingml/2006/picture">
                 <pic:pic>
                   <pic:nvPicPr>
-                    <pic:cNvPr id="0" name="05_account.png"/>
+                    <pic:cNvPr id="0" name="image.png"/>
                     <pic:cNvPicPr/>
                   </pic:nvPicPr>
                   <pic:blipFill>
-                    <a:blip r:embed="rId13"/>
+                    <a:blip r:embed="rId19"/>
                     <a:stretch>
                       <a:fillRect/>
                     </a:stretch>
@@ -1417,7 +1385,7 @@
           <w:color w:val="5A5A5A"/>
           <w:sz w:val="19"/>
         </w:rPr>
-        <w:t>圖 5：帳號與同步頁，Neon API 未設定時自動使用本地模式。</w:t>
+        <w:t>圖 5：帳號與雲端同步頁，顯示已登入的測試帳號與手動同步功能。</w:t>
       </w:r>
     </w:p>
     <w:p>
@@ -1445,7 +1413,7 @@
           <w:b w:val="0"/>
           <w:sz w:val="22"/>
         </w:rPr>
-        <w:t>本次完善後已執行以下驗證，確認核心模型、同步設定、靜態分析與 Android APK 建置皆可通過。</w:t>
+        <w:t>本次已完成模型與服務單元測試、Flutter 靜態分析、Release APK 建置、Gemini 同圖辨識、Pixel 9 Pro XL 模擬器流程與真實 Neon 端到端同步驗證。</w:t>
       </w:r>
     </w:p>
     <w:tbl>
@@ -1493,14 +1461,8 @@
               <w:spacing w:after="0"/>
               <w:jc w:val="left"/>
             </w:pPr>
-            <w:r/>
             <w:r>
-              <w:rPr>
-                <w:rFonts w:ascii="Microsoft JhengHei" w:hAnsi="Microsoft JhengHei" w:eastAsia="Microsoft JhengHei"/>
-                <w:b w:val="0"/>
-                <w:sz w:val="21"/>
-              </w:rPr>
-              <w:t>flutter test test/models test/services：6 tests passed</w:t>
+              <w:t>flutter test test/models test/services：8 tests passed</w:t>
             </w:r>
           </w:p>
         </w:tc>
@@ -1631,14 +1593,8 @@
               <w:spacing w:after="0"/>
               <w:jc w:val="left"/>
             </w:pPr>
-            <w:r/>
             <w:r>
-              <w:rPr>
-                <w:rFonts w:ascii="Microsoft JhengHei" w:hAnsi="Microsoft JhengHei" w:eastAsia="Microsoft JhengHei"/>
-                <w:b w:val="0"/>
-                <w:sz w:val="21"/>
-              </w:rPr>
-              <w:t>flutter build apk --release：成功建置 49.8MB APK</w:t>
+              <w:t>flutter build apk --release：成功建置 50.7 MB APK</w:t>
             </w:r>
           </w:p>
         </w:tc>
@@ -1769,14 +1725,30 @@
               <w:spacing w:after="0"/>
               <w:jc w:val="left"/>
             </w:pPr>
-            <w:r/>
             <w:r>
-              <w:rPr>
-                <w:rFonts w:ascii="Microsoft JhengHei" w:hAnsi="Microsoft JhengHei" w:eastAsia="Microsoft JhengHei"/>
-                <w:b w:val="0"/>
-                <w:sz w:val="21"/>
-              </w:rPr>
-              <w:t>Pixel 9 Pro XL emulator 安裝 release APK 並完成截圖/錄影</w:t>
+              <w:t>Pixel 9 Pro XL emulator：實際圖片分析、記帳、飲食規劃、帳號、同步、截圖與錄影皆通過</w:t>
+            </w:r>
+          </w:p>
+        </w:tc>
+      </w:tr>
+      <w:tr>
+        <w:tc>
+          <w:tcPr>
+            <w:tcW w:type="dxa" w:w="4968"/>
+          </w:tcPr>
+          <w:p>
+            <w:r>
+              <w:t>Neon 端到端測試</w:t>
+            </w:r>
+          </w:p>
+        </w:tc>
+        <w:tc>
+          <w:tcPr>
+            <w:tcW w:type="dxa" w:w="4968"/>
+          </w:tcPr>
+          <w:p>
+            <w:r>
+              <w:t>帳號註冊成功；同步 1 筆分析與 1 筆飲食紀錄；Dashboard 待同步 0 筆</w:t>
             </w:r>
           </w:p>
         </w:tc>
@@ -1802,42 +1774,34 @@
         <w:spacing w:line="283" w:lineRule="auto" w:after="120"/>
       </w:pPr>
       <w:r>
-        <w:rPr>
-          <w:rFonts w:ascii="Microsoft JhengHei" w:hAnsi="Microsoft JhengHei" w:eastAsia="Microsoft JhengHei"/>
-          <w:b/>
-          <w:sz w:val="22"/>
-        </w:rPr>
         <w:t>GitHub 專案：</w:t>
       </w:r>
-      <w:r>
-        <w:rPr>
-          <w:rFonts w:ascii="Microsoft JhengHei" w:hAnsi="Microsoft JhengHei" w:eastAsia="Microsoft JhengHei"/>
-          <w:b w:val="0"/>
-          <w:sz w:val="22"/>
-        </w:rPr>
-        <w:t>https://github.com/yuchan27/Ingredient-AI</w:t>
-      </w:r>
+      <w:hyperlink r:id="rId20">
+        <w:r>
+          <w:rPr>
+            <w:color w:val="0563C1"/>
+            <w:u w:val="single"/>
+          </w:rPr>
+          <w:t>https://github.com/yuchan27/Ingredient-AI</w:t>
+        </w:r>
+      </w:hyperlink>
     </w:p>
     <w:p>
       <w:pPr>
         <w:spacing w:line="283" w:lineRule="auto" w:after="120"/>
       </w:pPr>
       <w:r>
-        <w:rPr>
-          <w:rFonts w:ascii="Microsoft JhengHei" w:hAnsi="Microsoft JhengHei" w:eastAsia="Microsoft JhengHei"/>
-          <w:b/>
-          <w:sz w:val="22"/>
-        </w:rPr>
         <w:t>操作影片連結：</w:t>
       </w:r>
-      <w:r>
-        <w:rPr>
-          <w:rFonts w:ascii="Microsoft JhengHei" w:hAnsi="Microsoft JhengHei" w:eastAsia="Microsoft JhengHei"/>
-          <w:b w:val="0"/>
-          <w:sz w:val="22"/>
-        </w:rPr>
-        <w:t>https://github.com/yuchan27/Ingredient-AI/blob/codex/food-analysis-cloud-sync/artifacts/videos/ingredient_ai_demo.mp4</w:t>
-      </w:r>
+      <w:hyperlink r:id="rId21">
+        <w:r>
+          <w:rPr>
+            <w:color w:val="0563C1"/>
+            <w:u w:val="single"/>
+          </w:rPr>
+          <w:t>https://github.com/yuchan27/Ingredient-AI/blob/codex/food-analysis-cloud-sync/artifacts/videos/ingredient_ai_demo.mp4</w:t>
+        </w:r>
+      </w:hyperlink>
     </w:p>
     <w:p>
       <w:pPr>
@@ -1849,7 +1813,7 @@
           <w:b w:val="0"/>
           <w:sz w:val="22"/>
         </w:rPr>
-        <w:t>若繳交前尚未將影片推上 GitHub 或上傳至 Google Drive/YouTube，請使用本機影片 artifacts/videos/ingredient_ai_demo.mp4 上傳後替換此連結。</w:t>
+        <w:t>操作影片已實際錄製真實雞排營養標籤分析、今日熱量與下一餐建議，以及 Neon 帳號同步畫面，並存放於上述 GitHub 連結。</w:t>
       </w:r>
     </w:p>
     <w:p>
@@ -1877,7 +1841,7 @@
           <w:b w:val="0"/>
           <w:sz w:val="22"/>
         </w:rPr>
-        <w:t>本專案已從單純的食品成分分析工具，擴充為具備 AI 分析、飲食紀錄、營養 Dashboard、語音輸入、本地離線保存與 Neon Postgres 雲端同步架構的完整 App 原型。使用者在沒有網路或尚未登入時仍可保存資料；當雲端 API 設定完成並登入後，即可把本地資料同步至 Neon Postgres。</w:t>
+        <w:t>本專案已從單次食品分析工具擴充為具備 AI 圖片辨識、營養標籤解析、飲食記帳、日期紀錄、熱量與營養總覽、下一餐建議、語音輸入、SQLite 離線保存、帳號與 Neon Postgres 同步的完整 App 原型。</w:t>
       </w:r>
     </w:p>
     <w:p>
@@ -1890,7 +1854,7 @@
           <w:b w:val="0"/>
           <w:sz w:val="22"/>
         </w:rPr>
-        <w:t>後續可改善方向包含：部署 Neon API 至正式雲端主機、加入條碼掃描、建立更完整的食品資料庫、支援圖表週/月統計、加入第三方登入，以及把操作影片上傳至公開平台取得正式繳交連結。</w:t>
+        <w:t>後續可改善方向包含：將 Node API 部署至正式雲端主機、加入條碼掃描與第三方登入、建立完整食品資料庫、支援週/月匯出，以及加入通知與個人化熱量目標。</w:t>
       </w:r>
     </w:p>
     <w:p>

</xml_diff>

<commit_message>
docs: link final project branch
</commit_message>
<xml_diff>
--- a/C11215139_medium_Flutter_final_report.docx
+++ b/C11215139_medium_Flutter_final_report.docx
@@ -271,7 +271,7 @@
               <w:jc w:val="left"/>
             </w:pPr>
             <w:r>
-              <w:t>https://github.com/yuchan27/Ingredient-AI</w:t>
+              <w:t>https://github.com/yuchan27/Ingredient-AI/tree/codex/food-analysis-cloud-sync</w:t>
             </w:r>
           </w:p>
         </w:tc>
@@ -1782,7 +1782,7 @@
             <w:color w:val="0563C1"/>
             <w:u w:val="single"/>
           </w:rPr>
-          <w:t>https://github.com/yuchan27/Ingredient-AI</w:t>
+          <w:t>https://github.com/yuchan27/Ingredient-AI/tree/codex/food-analysis-cloud-sync</w:t>
         </w:r>
       </w:hyperlink>
     </w:p>

</xml_diff>